<commit_message>
fix(cv): apply strict ATS formatting, timeline standardization, and tone calibration
</commit_message>
<xml_diff>
--- a/public/Emmanuel_Aro_CV.docx
+++ b/public/Emmanuel_Aro_CV.docx
@@ -57,7 +57,7 @@
         <w:spacing w:after="120"/>
       </w:pPr>
       <w:r>
-        <w:t xml:space="preserve">Senior Full-Stack &amp; Systems Software Engineer with 6+ years of experience architecting distributed platforms, real-time systems, and production-grade agentic AI pipelines. Proven track record of shipping end-to-end solutions using Python (Django Ninja), TypeScript (Next.js App Router), PostgreSQL, and Docker across 7 companies globally. Adept at designing defensible API contracts, orchestrating GPU serverless infrastructure for ML workloads, and optimizing database layers to ensure high availability, low latency, and massive concurrency under load.</w:t>
+        <w:t xml:space="preserve">Full-Stack &amp; Systems Software Engineer with 4+ years of professional engineering experience architecting distributed platforms, real-time systems, and production-grade applied AI pipelines. Proven track record of shipping end-to-end solutions using Python (Django Ninja), TypeScript (Next.js App Router), PostgreSQL, and Docker across 7 companies globally. Adept at designing defensible API contracts, orchestrating GPU serverless infrastructure for ML workloads, and optimizing database layers to ensure high availability, low latency, and massive concurrency under load.</w:t>
       </w:r>
     </w:p>
     <w:p>
@@ -106,10 +106,30 @@
           <w:b/>
           <w:bCs/>
         </w:rPr>
-        <w:t xml:space="preserve">Distributed Systems &amp; Backend: </w:t>
-      </w:r>
-      <w:r>
-        <w:t xml:space="preserve">Django Ninja, Node.js, Next.js (App Router), FastAPI, REST APIs, GraphQL, WebSockets, Celery, Redis</w:t>
+        <w:t xml:space="preserve">Frameworks &amp; Full-Stack: </w:t>
+      </w:r>
+      <w:r>
+        <w:t xml:space="preserve">Next.js (App Router), React, Django / Django Ninja, Laravel, FastAPI, Node.js</w:t>
+      </w:r>
+    </w:p>
+    <w:p>
+      <w:pPr>
+        <w:pStyle w:val="ListParagraph"/>
+        <w:numPr>
+          <w:ilvl w:val="0"/>
+          <w:numId w:val="1"/>
+        </w:numPr>
+        <w:spacing w:after="60"/>
+      </w:pPr>
+      <w:r>
+        <w:rPr>
+          <w:b/>
+          <w:bCs/>
+        </w:rPr>
+        <w:t xml:space="preserve">Distributed Systems &amp; APIs: </w:t>
+      </w:r>
+      <w:r>
+        <w:t xml:space="preserve">RESTful APIs, GraphQL, WebSockets, Celery, Redis, Task Queues</w:t>
       </w:r>
     </w:p>
     <w:p>
@@ -146,30 +166,30 @@
           <w:b/>
           <w:bCs/>
         </w:rPr>
-        <w:t xml:space="preserve">Cloud, DevOps &amp; Infrastructure: </w:t>
-      </w:r>
-      <w:r>
-        <w:t xml:space="preserve">Docker, Docker Compose, AWS (EC2, S3, RDS), Modal (Serverless GPU), Linux/Bash, GitHub Actions CI/CD</w:t>
-      </w:r>
-    </w:p>
-    <w:p>
-      <w:pPr>
-        <w:pStyle w:val="ListParagraph"/>
-        <w:numPr>
-          <w:ilvl w:val="0"/>
-          <w:numId w:val="1"/>
-        </w:numPr>
-        <w:spacing w:after="60"/>
-      </w:pPr>
-      <w:r>
-        <w:rPr>
-          <w:b/>
-          <w:bCs/>
-        </w:rPr>
-        <w:t xml:space="preserve">Data &amp; Storage: </w:t>
-      </w:r>
-      <w:r>
-        <w:t xml:space="preserve">PostgreSQL (pgvector, RLS), MySQL, Redis, Supabase, Schema Modeling &amp; Query Optimization</w:t>
+        <w:t xml:space="preserve">Databases &amp; Storage: </w:t>
+      </w:r>
+      <w:r>
+        <w:t xml:space="preserve">PostgreSQL (pgvector, RLS), Supabase, MySQL, Redis, Schema Modeling &amp; Query Optimization</w:t>
+      </w:r>
+    </w:p>
+    <w:p>
+      <w:pPr>
+        <w:pStyle w:val="ListParagraph"/>
+        <w:numPr>
+          <w:ilvl w:val="0"/>
+          <w:numId w:val="1"/>
+        </w:numPr>
+        <w:spacing w:after="60"/>
+      </w:pPr>
+      <w:r>
+        <w:rPr>
+          <w:b/>
+          <w:bCs/>
+        </w:rPr>
+        <w:t xml:space="preserve">Cloud, DevOps &amp; Tooling: </w:t>
+      </w:r>
+      <w:r>
+        <w:t xml:space="preserve">Docker, Docker Compose, AWS (EC2, S3, RDS), Modal (Serverless GPU), Linux/Bash, GitHub Actions CI/CD, Postman</w:t>
       </w:r>
     </w:p>
     <w:p>
@@ -323,7 +343,7 @@
           <w:sz w:val="18"/>
           <w:szCs w:val="18"/>
         </w:rPr>
-        <w:t xml:space="preserve"> | Oct 2024 – Present | Lagos, NG</w:t>
+        <w:t xml:space="preserve"> | Oct 2024 – Present | Lagos, NG (Contract / Concurrent)</w:t>
       </w:r>
     </w:p>
     <w:p>
@@ -1025,40 +1045,40 @@
           <w:b/>
           <w:bCs/>
         </w:rPr>
-        <w:t xml:space="preserve">B.Sc. in Computer Science</w:t>
-      </w:r>
-      <w:r>
-        <w:t xml:space="preserve"> | Federal University Oye-Ekiti, Nigeria (2025)</w:t>
-      </w:r>
-    </w:p>
-    <w:p>
-      <w:pPr>
-        <w:spacing w:after="60"/>
-      </w:pPr>
-      <w:r>
-        <w:rPr>
-          <w:b/>
-          <w:bCs/>
-        </w:rPr>
-        <w:t xml:space="preserve">Full Stack Engineer Certificate</w:t>
-      </w:r>
-      <w:r>
-        <w:t xml:space="preserve"> | Google Developer Student Club (2024)</w:t>
-      </w:r>
-    </w:p>
-    <w:p>
-      <w:pPr>
-        <w:spacing w:after="60"/>
-      </w:pPr>
-      <w:r>
-        <w:rPr>
-          <w:b/>
-          <w:bCs/>
-        </w:rPr>
-        <w:t xml:space="preserve">Advanced Software Engineering Certification</w:t>
-      </w:r>
-      <w:r>
-        <w:t xml:space="preserve"> | GB-Tech Learning Centre (2023)</w:t>
+        <w:t xml:space="preserve">B.Sc. in Computer Science </w:t>
+      </w:r>
+      <w:r>
+        <w:t xml:space="preserve">— Federal University Oye-Ekiti, Nigeria (2025)</w:t>
+      </w:r>
+    </w:p>
+    <w:p>
+      <w:pPr>
+        <w:spacing w:after="60"/>
+      </w:pPr>
+      <w:r>
+        <w:rPr>
+          <w:b/>
+          <w:bCs/>
+        </w:rPr>
+        <w:t xml:space="preserve">Full Stack Engineer Certification </w:t>
+      </w:r>
+      <w:r>
+        <w:t xml:space="preserve">— Google Developer Student Clubs (2024)</w:t>
+      </w:r>
+    </w:p>
+    <w:p>
+      <w:pPr>
+        <w:spacing w:after="60"/>
+      </w:pPr>
+      <w:r>
+        <w:rPr>
+          <w:b/>
+          <w:bCs/>
+        </w:rPr>
+        <w:t xml:space="preserve">Advanced Software Engineering Certification </w:t>
+      </w:r>
+      <w:r>
+        <w:t xml:space="preserve">— GB-Tech Learning Centre, Nigeria (2023)</w:t>
       </w:r>
     </w:p>
     <w:sectPr>

</xml_diff>

<commit_message>
chore: remove senior title and update to 4+ years of experience across portfolio
</commit_message>
<xml_diff>
--- a/public/Emmanuel_Aro_CV.docx
+++ b/public/Emmanuel_Aro_CV.docx
@@ -28,7 +28,7 @@
           <w:sz w:val="20"/>
           <w:szCs w:val="20"/>
         </w:rPr>
-        <w:t xml:space="preserve">Senior Full-Stack &amp; Systems Software Engineer | Distributed Systems &amp; Applied AI</w:t>
+        <w:t xml:space="preserve">Full-Stack &amp; Systems Software Engineer | Distributed Systems &amp; Applied AI</w:t>
       </w:r>
     </w:p>
     <w:p>
@@ -89,7 +89,7 @@
         <w:t xml:space="preserve">Languages: </w:t>
       </w:r>
       <w:r>
-        <w:t xml:space="preserve">Python, TypeScript, JavaScript (ES6+), PHP, SQL, HTML5/CSS3</w:t>
+        <w:t xml:space="preserve">Python, TypeScript, JavaScript (ES4+), PHP, SQL, HTML5/CSS3</w:t>
       </w:r>
     </w:p>
     <w:p>
@@ -441,7 +441,7 @@
           <w:sz w:val="18"/>
           <w:szCs w:val="18"/>
         </w:rPr>
-        <w:t xml:space="preserve">Senior Software Developer, Platform Engineering</w:t>
+        <w:t xml:space="preserve">Software Developer, Platform Engineering</w:t>
       </w:r>
       <w:r>
         <w:rPr>

</xml_diff>